<commit_message>
Kiosk: cua so danh sach cong kham da chon, cho phep xoa tung dich vu
- Them frmSelectedExamList: luoi cong kham da chon, moi dong co nut XOA,
  ba nut CHON THEM PHONG / DANG KY (n) / DONG, tu dong dong theo bo dem cua kiosk.
- Thay 2 hop thoai cu (hoi chon them, hoi dang ky hay bo chon) bang cua so nay.
- Xoa duoc bat ky cong kham nao; xoa dong dau tien thi dong ke tiep thanh cong kham chinh.
- Gop mainExamSelection va extraExamSelections thanh mot danh sach examSelections,
  phan tu [0] la cong kham chinh, cac phan tu sau gui qua AdditionalServices.
- Dang ky nhieu cong kham van nam sau key IsAllowRegisterMultiExam.
- Cap nhat tai lieu nghiep vu: docs/A_NghiepVu_DangKyNhieuCongKham_Kiosk

Co-Authored-By: Claude Opus 5 <noreply@anthropic.com>
</commit_message>
<xml_diff>
--- a/docs/A_NghiepVu_DangKyNhieuCongKham_Kiosk.docx
+++ b/docs/A_NghiepVu_DangKyNhieuCongKham_Kiosk.docx
@@ -921,7 +921,7 @@
                 <w:i w:val="0"/>
                 <w:sz w:val="22"/>
               </w:rPr>
-              <w:t>Xem lại danh sách đã chọn và bỏ chọn từng phòng</w:t>
+              <w:t>Cửa sổ danh sách: xem lại, xóa từng công khám, xác nhận đăng ký</w:t>
             </w:r>
           </w:p>
         </w:tc>
@@ -1297,7 +1297,7 @@
           <w:i w:val="0"/>
           <w:sz w:val="24"/>
         </w:rPr>
-        <w:t xml:space="preserve">Nguyên tắc triển khai: </w:t>
+        <w:t xml:space="preserve">Màn chọn phòng khám </w:t>
       </w:r>
       <w:r>
         <w:rPr>
@@ -1306,7 +1306,7 @@
           <w:i w:val="0"/>
           <w:sz w:val="24"/>
         </w:rPr>
-        <w:t>giữ nguyên bố cục màn hình kiosk hiện tại</w:t>
+        <w:t>giữ nguyên bố cục hiện tại</w:t>
       </w:r>
       <w:r>
         <w:rPr>
@@ -1315,7 +1315,25 @@
           <w:i w:val="0"/>
           <w:sz w:val="24"/>
         </w:rPr>
-        <w:t>, không thêm vùng hiển thị mới, không thêm nút mới. Việc chọn nhiều công khám thực hiện qua chính các ô phòng khám đang có và các hộp thoại xác nhận — cùng cách kiosk đang hỏi người bệnh hiện nay.</w:t>
+        <w:t xml:space="preserve">. Việc chọn nhiều công khám thực hiện qua chính các ô phòng đang có, cộng thêm </w:t>
+      </w:r>
+      <w:r>
+        <w:rPr>
+          <w:rFonts w:ascii="Times New Roman" w:hAnsi="Times New Roman" w:cs="Times New Roman" w:eastAsia="Times New Roman"/>
+          <w:b/>
+          <w:i w:val="0"/>
+          <w:sz w:val="24"/>
+        </w:rPr>
+        <w:t>một cửa sổ danh sách</w:t>
+      </w:r>
+      <w:r>
+        <w:rPr>
+          <w:rFonts w:ascii="Times New Roman" w:hAnsi="Times New Roman" w:cs="Times New Roman" w:eastAsia="Times New Roman"/>
+          <w:b w:val="0"/>
+          <w:i w:val="0"/>
+          <w:sz w:val="24"/>
+        </w:rPr>
+        <w:t xml:space="preserve"> để người bệnh xem lại, xóa bớt và xác nhận đăng ký.</w:t>
       </w:r>
     </w:p>
     <w:p>
@@ -1530,32 +1548,7 @@
                 <w:i w:val="0"/>
                 <w:sz w:val="22"/>
               </w:rPr>
-              <w:t>Ghi nhận công khám vào danh sách rồi hỏi *"Bạn có muốn chọn thêm phòng khám khác không?"*</w:t>
-            </w:r>
-          </w:p>
-        </w:tc>
-      </w:tr>
-      <w:tr>
-        <w:tc>
-          <w:tcPr>
-            <w:tcW w:type="dxa" w:w="2880"/>
-            <w:tcBorders>
-              <w:top w:val="single" w:sz="4" w:color="9AA5B1"/>
-              <w:left w:val="single" w:sz="4" w:color="9AA5B1"/>
-              <w:bottom w:val="single" w:sz="4" w:color="9AA5B1"/>
-              <w:right w:val="single" w:sz="4" w:color="9AA5B1"/>
-            </w:tcBorders>
-          </w:tcPr>
-          <w:p>
-            <w:r/>
-            <w:r>
-              <w:rPr>
-                <w:rFonts w:ascii="Times New Roman" w:hAnsi="Times New Roman" w:cs="Times New Roman" w:eastAsia="Times New Roman"/>
-                <w:b w:val="0"/>
-                <w:i w:val="0"/>
-                <w:sz w:val="22"/>
-              </w:rPr>
-              <w:t xml:space="preserve">Trả lời </w:t>
+              <w:t xml:space="preserve">Ghi nhận công khám rồi </w:t>
             </w:r>
             <w:r>
               <w:rPr>
@@ -1564,22 +1557,8 @@
                 <w:i w:val="0"/>
                 <w:sz w:val="22"/>
               </w:rPr>
-              <w:t>Không</w:t>
+              <w:t>mở cửa sổ danh sách</w:t>
             </w:r>
-          </w:p>
-        </w:tc>
-        <w:tc>
-          <w:tcPr>
-            <w:tcW w:type="dxa" w:w="2880"/>
-            <w:tcBorders>
-              <w:top w:val="single" w:sz="4" w:color="9AA5B1"/>
-              <w:left w:val="single" w:sz="4" w:color="9AA5B1"/>
-              <w:bottom w:val="single" w:sz="4" w:color="9AA5B1"/>
-              <w:right w:val="single" w:sz="4" w:color="9AA5B1"/>
-            </w:tcBorders>
-          </w:tcPr>
-          <w:p>
-            <w:r/>
             <w:r>
               <w:rPr>
                 <w:rFonts w:ascii="Times New Roman" w:hAnsi="Times New Roman" w:cs="Times New Roman" w:eastAsia="Times New Roman"/>
@@ -1587,110 +1566,7 @@
                 <w:i w:val="0"/>
                 <w:sz w:val="22"/>
               </w:rPr>
-              <w:t>Không có</w:t>
-            </w:r>
-          </w:p>
-        </w:tc>
-        <w:tc>
-          <w:tcPr>
-            <w:tcW w:type="dxa" w:w="2880"/>
-            <w:tcBorders>
-              <w:top w:val="single" w:sz="4" w:color="9AA5B1"/>
-              <w:left w:val="single" w:sz="4" w:color="9AA5B1"/>
-              <w:bottom w:val="single" w:sz="4" w:color="9AA5B1"/>
-              <w:right w:val="single" w:sz="4" w:color="9AA5B1"/>
-            </w:tcBorders>
-          </w:tcPr>
-          <w:p>
-            <w:r/>
-            <w:r>
-              <w:rPr>
-                <w:rFonts w:ascii="Times New Roman" w:hAnsi="Times New Roman" w:cs="Times New Roman" w:eastAsia="Times New Roman"/>
-                <w:b w:val="0"/>
-                <w:i w:val="0"/>
-                <w:sz w:val="22"/>
-              </w:rPr>
-              <w:t>Đăng ký toàn bộ công khám đã chọn, in phiếu, kết thúc</w:t>
-            </w:r>
-          </w:p>
-        </w:tc>
-      </w:tr>
-      <w:tr>
-        <w:tc>
-          <w:tcPr>
-            <w:tcW w:type="dxa" w:w="2880"/>
-            <w:tcBorders>
-              <w:top w:val="single" w:sz="4" w:color="9AA5B1"/>
-              <w:left w:val="single" w:sz="4" w:color="9AA5B1"/>
-              <w:bottom w:val="single" w:sz="4" w:color="9AA5B1"/>
-              <w:right w:val="single" w:sz="4" w:color="9AA5B1"/>
-            </w:tcBorders>
-          </w:tcPr>
-          <w:p>
-            <w:r/>
-            <w:r>
-              <w:rPr>
-                <w:rFonts w:ascii="Times New Roman" w:hAnsi="Times New Roman" w:cs="Times New Roman" w:eastAsia="Times New Roman"/>
-                <w:b w:val="0"/>
-                <w:i w:val="0"/>
-                <w:sz w:val="22"/>
-              </w:rPr>
-              <w:t xml:space="preserve">Trả lời </w:t>
-            </w:r>
-            <w:r>
-              <w:rPr>
-                <w:rFonts w:ascii="Times New Roman" w:hAnsi="Times New Roman" w:cs="Times New Roman" w:eastAsia="Times New Roman"/>
-                <w:b/>
-                <w:i w:val="0"/>
-                <w:sz w:val="22"/>
-              </w:rPr>
-              <w:t>Có</w:t>
-            </w:r>
-          </w:p>
-        </w:tc>
-        <w:tc>
-          <w:tcPr>
-            <w:tcW w:type="dxa" w:w="2880"/>
-            <w:tcBorders>
-              <w:top w:val="single" w:sz="4" w:color="9AA5B1"/>
-              <w:left w:val="single" w:sz="4" w:color="9AA5B1"/>
-              <w:bottom w:val="single" w:sz="4" w:color="9AA5B1"/>
-              <w:right w:val="single" w:sz="4" w:color="9AA5B1"/>
-            </w:tcBorders>
-          </w:tcPr>
-          <w:p>
-            <w:r/>
-            <w:r>
-              <w:rPr>
-                <w:rFonts w:ascii="Times New Roman" w:hAnsi="Times New Roman" w:cs="Times New Roman" w:eastAsia="Times New Roman"/>
-                <w:b w:val="0"/>
-                <w:i w:val="0"/>
-                <w:sz w:val="22"/>
-              </w:rPr>
-              <w:t>Không có</w:t>
-            </w:r>
-          </w:p>
-        </w:tc>
-        <w:tc>
-          <w:tcPr>
-            <w:tcW w:type="dxa" w:w="2880"/>
-            <w:tcBorders>
-              <w:top w:val="single" w:sz="4" w:color="9AA5B1"/>
-              <w:left w:val="single" w:sz="4" w:color="9AA5B1"/>
-              <w:bottom w:val="single" w:sz="4" w:color="9AA5B1"/>
-              <w:right w:val="single" w:sz="4" w:color="9AA5B1"/>
-            </w:tcBorders>
-          </w:tcPr>
-          <w:p>
-            <w:r/>
-            <w:r>
-              <w:rPr>
-                <w:rFonts w:ascii="Times New Roman" w:hAnsi="Times New Roman" w:cs="Times New Roman" w:eastAsia="Times New Roman"/>
-                <w:b w:val="0"/>
-                <w:i w:val="0"/>
-                <w:sz w:val="22"/>
-              </w:rPr>
-              <w:t>Quay lại màn chọn phòng để chạm phòng tiếp theo</w:t>
+              <w:t xml:space="preserve"> (2.2)</w:t>
             </w:r>
           </w:p>
         </w:tc>
@@ -1761,7 +1637,7 @@
                 <w:i w:val="0"/>
                 <w:sz w:val="22"/>
               </w:rPr>
-              <w:t>Mở cửa sổ chọn dịch vụ, chọn xong quay về màn chọn phòng và hỏi như trên</w:t>
+              <w:t>Mở cửa sổ chọn dịch vụ, chọn xong mở cửa sổ danh sách</w:t>
             </w:r>
           </w:p>
         </w:tc>
@@ -1786,7 +1662,7 @@
                 <w:i w:val="0"/>
                 <w:sz w:val="22"/>
               </w:rPr>
-              <w:t>Chạm lại phòng đã chọn</w:t>
+              <w:t>Chạm lại ô phòng đã chọn</w:t>
             </w:r>
           </w:p>
         </w:tc>
@@ -1828,11 +1704,20 @@
             <w:r>
               <w:rPr>
                 <w:rFonts w:ascii="Times New Roman" w:hAnsi="Times New Roman" w:cs="Times New Roman" w:eastAsia="Times New Roman"/>
+                <w:b/>
+                <w:i w:val="0"/>
+                <w:sz w:val="22"/>
+              </w:rPr>
+              <w:t>Mở cửa sổ danh sách</w:t>
+            </w:r>
+            <w:r>
+              <w:rPr>
+                <w:rFonts w:ascii="Times New Roman" w:hAnsi="Times New Roman" w:cs="Times New Roman" w:eastAsia="Times New Roman"/>
                 <w:b w:val="0"/>
                 <w:i w:val="0"/>
                 <w:sz w:val="22"/>
               </w:rPr>
-              <w:t>Hỏi đăng ký ngay hoặc bỏ chọn phòng đó (2.3)</w:t>
+              <w:t xml:space="preserve"> để xóa bớt hoặc đăng ký</w:t>
             </w:r>
           </w:p>
         </w:tc>
@@ -1851,22 +1736,7 @@
           <w:color w:val="12457A"/>
           <w:sz w:val="27"/>
         </w:rPr>
-        <w:t>2.2 Hộp thoại xác nhận sau mỗi lần chọn</w:t>
-      </w:r>
-    </w:p>
-    <w:p>
-      <w:pPr>
-        <w:spacing w:after="120"/>
-        <w:jc w:val="both"/>
-      </w:pPr>
-      <w:r>
-        <w:rPr>
-          <w:rFonts w:ascii="Times New Roman" w:hAnsi="Times New Roman" w:cs="Times New Roman" w:eastAsia="Times New Roman"/>
-          <w:b w:val="0"/>
-          <w:i w:val="0"/>
-          <w:sz w:val="24"/>
-        </w:rPr>
-        <w:t>Mỗi lần người bệnh chọn xong một công khám, kiosk hiển thị danh sách đã chọn kèm câu hỏi:</w:t>
+        <w:t>2.2 Cửa sổ "Các phòng khám bạn đã chọn"</w:t>
       </w:r>
     </w:p>
     <w:p>
@@ -1881,7 +1751,7 @@
           <w:i w:val="0"/>
           <w:sz w:val="21"/>
         </w:rPr>
-        <w:t>Bạn đã chọn:</w:t>
+        <w:t>┌──────────────────────────────────────────────────────────┐</w:t>
       </w:r>
     </w:p>
     <w:p>
@@ -1896,7 +1766,7 @@
           <w:i w:val="0"/>
           <w:sz w:val="21"/>
         </w:rPr>
-        <w:t>1. Phòng khám Nội tổng hợp - Khám nội tổng hợp</w:t>
+        <w:t>│  CÁC PHÒNG KHÁM BẠN ĐÃ CHỌN                              │</w:t>
       </w:r>
     </w:p>
     <w:p>
@@ -1911,7 +1781,97 @@
           <w:i w:val="0"/>
           <w:sz w:val="21"/>
         </w:rPr>
-        <w:t>2. Phòng khám Tai Mũi Họng - Khám tai mũi họng</w:t>
+        <w:t>├────┬──────────────────────┬────────────────────┬─────────┤</w:t>
+      </w:r>
+    </w:p>
+    <w:p>
+      <w:pPr>
+        <w:spacing w:after="0"/>
+        <w:ind w:left="360"/>
+      </w:pPr>
+      <w:r>
+        <w:rPr>
+          <w:rFonts w:ascii="Consolas" w:hAnsi="Consolas" w:cs="Consolas" w:eastAsia="Consolas"/>
+          <w:b w:val="0"/>
+          <w:i w:val="0"/>
+          <w:sz w:val="21"/>
+        </w:rPr>
+        <w:t>│ TT │ Phòng khám           │ Dịch vụ khám       │         │</w:t>
+      </w:r>
+    </w:p>
+    <w:p>
+      <w:pPr>
+        <w:spacing w:after="0"/>
+        <w:ind w:left="360"/>
+      </w:pPr>
+      <w:r>
+        <w:rPr>
+          <w:rFonts w:ascii="Consolas" w:hAnsi="Consolas" w:cs="Consolas" w:eastAsia="Consolas"/>
+          <w:b w:val="0"/>
+          <w:i w:val="0"/>
+          <w:sz w:val="21"/>
+        </w:rPr>
+        <w:t>├────┼──────────────────────┼────────────────────┼─────────┤</w:t>
+      </w:r>
+    </w:p>
+    <w:p>
+      <w:pPr>
+        <w:spacing w:after="0"/>
+        <w:ind w:left="360"/>
+      </w:pPr>
+      <w:r>
+        <w:rPr>
+          <w:rFonts w:ascii="Consolas" w:hAnsi="Consolas" w:cs="Consolas" w:eastAsia="Consolas"/>
+          <w:b w:val="0"/>
+          <w:i w:val="0"/>
+          <w:sz w:val="21"/>
+        </w:rPr>
+        <w:t>│ 1  │ Nội tổng hợp         │ Khám nội tổng hợp  │  [ XÓA ]│</w:t>
+      </w:r>
+    </w:p>
+    <w:p>
+      <w:pPr>
+        <w:spacing w:after="0"/>
+        <w:ind w:left="360"/>
+      </w:pPr>
+      <w:r>
+        <w:rPr>
+          <w:rFonts w:ascii="Consolas" w:hAnsi="Consolas" w:cs="Consolas" w:eastAsia="Consolas"/>
+          <w:b w:val="0"/>
+          <w:i w:val="0"/>
+          <w:sz w:val="21"/>
+        </w:rPr>
+        <w:t>│ 2  │ Tai Mũi Họng         │ Khám tai mũi họng  │  [ XÓA ]│</w:t>
+      </w:r>
+    </w:p>
+    <w:p>
+      <w:pPr>
+        <w:spacing w:after="0"/>
+        <w:ind w:left="360"/>
+      </w:pPr>
+      <w:r>
+        <w:rPr>
+          <w:rFonts w:ascii="Consolas" w:hAnsi="Consolas" w:cs="Consolas" w:eastAsia="Consolas"/>
+          <w:b w:val="0"/>
+          <w:i w:val="0"/>
+          <w:sz w:val="21"/>
+        </w:rPr>
+        <w:t>└────┴──────────────────────┴────────────────────┴─────────┘</w:t>
+      </w:r>
+    </w:p>
+    <w:p>
+      <w:pPr>
+        <w:spacing w:after="0"/>
+        <w:ind w:left="360"/>
+      </w:pPr>
+      <w:r>
+        <w:rPr>
+          <w:rFonts w:ascii="Consolas" w:hAnsi="Consolas" w:cs="Consolas" w:eastAsia="Consolas"/>
+          <w:b w:val="0"/>
+          <w:i w:val="0"/>
+          <w:sz w:val="21"/>
+        </w:rPr>
+        <w:t xml:space="preserve">   Phòng khám đầu tiên trong danh sách là phòng khám chính</w:t>
       </w:r>
     </w:p>
     <w:p>
@@ -1940,7 +1900,7 @@
           <w:i w:val="0"/>
           <w:sz w:val="21"/>
         </w:rPr>
-        <w:t>Bạn có muốn chọn thêm phòng khám khác không?</w:t>
+        <w:t>┌────────────────────┬──────────────────┬──────────────────┐</w:t>
       </w:r>
     </w:p>
     <w:p>
@@ -1955,6 +1915,7 @@
           <w:i w:val="0"/>
           <w:sz w:val="21"/>
         </w:rPr>
+        <w:t>│ + CHỌN THÊM PHÒNG  │    ĐĂNG KÝ (2)   │      ĐÓNG        │</w:t>
       </w:r>
     </w:p>
     <w:p>
@@ -1969,9 +1930,449 @@
           <w:i w:val="0"/>
           <w:sz w:val="21"/>
         </w:rPr>
-        <w:t xml:space="preserve">                              [ Có ]   [ Không ]</w:t>
+        <w:t>└────────────────────┴──────────────────┴──────────────────┘</w:t>
       </w:r>
     </w:p>
+    <w:p/>
+    <w:tbl>
+      <w:tblPr>
+        <w:tblStyle w:val="TableGrid"/>
+        <w:tblW w:type="auto" w:w="0"/>
+        <w:jc w:val="center"/>
+        <w:tblLook w:firstColumn="1" w:firstRow="1" w:lastColumn="0" w:lastRow="0" w:noHBand="0" w:noVBand="1" w:val="04A0"/>
+      </w:tblPr>
+      <w:tblGrid>
+        <w:gridCol w:w="4320"/>
+        <w:gridCol w:w="4320"/>
+      </w:tblGrid>
+      <w:tr>
+        <w:tc>
+          <w:tcPr>
+            <w:tcW w:type="dxa" w:w="4320"/>
+            <w:shd w:val="clear" w:fill="DCE6F1"/>
+            <w:tcBorders>
+              <w:top w:val="single" w:sz="4" w:color="9AA5B1"/>
+              <w:left w:val="single" w:sz="4" w:color="9AA5B1"/>
+              <w:bottom w:val="single" w:sz="4" w:color="9AA5B1"/>
+              <w:right w:val="single" w:sz="4" w:color="9AA5B1"/>
+            </w:tcBorders>
+          </w:tcPr>
+          <w:p>
+            <w:r>
+              <w:rPr>
+                <w:b/>
+              </w:rPr>
+            </w:r>
+            <w:r>
+              <w:rPr>
+                <w:rFonts w:ascii="Times New Roman" w:hAnsi="Times New Roman" w:cs="Times New Roman" w:eastAsia="Times New Roman"/>
+                <w:b/>
+                <w:i w:val="0"/>
+                <w:sz w:val="22"/>
+              </w:rPr>
+              <w:t>Thao tác</w:t>
+            </w:r>
+          </w:p>
+        </w:tc>
+        <w:tc>
+          <w:tcPr>
+            <w:tcW w:type="dxa" w:w="4320"/>
+            <w:shd w:val="clear" w:fill="DCE6F1"/>
+            <w:tcBorders>
+              <w:top w:val="single" w:sz="4" w:color="9AA5B1"/>
+              <w:left w:val="single" w:sz="4" w:color="9AA5B1"/>
+              <w:bottom w:val="single" w:sz="4" w:color="9AA5B1"/>
+              <w:right w:val="single" w:sz="4" w:color="9AA5B1"/>
+            </w:tcBorders>
+          </w:tcPr>
+          <w:p>
+            <w:r>
+              <w:rPr>
+                <w:b/>
+              </w:rPr>
+            </w:r>
+            <w:r>
+              <w:rPr>
+                <w:rFonts w:ascii="Times New Roman" w:hAnsi="Times New Roman" w:cs="Times New Roman" w:eastAsia="Times New Roman"/>
+                <w:b/>
+                <w:i w:val="0"/>
+                <w:sz w:val="22"/>
+              </w:rPr>
+              <w:t>Kết quả</w:t>
+            </w:r>
+          </w:p>
+        </w:tc>
+      </w:tr>
+      <w:tr>
+        <w:tc>
+          <w:tcPr>
+            <w:tcW w:type="dxa" w:w="4320"/>
+            <w:tcBorders>
+              <w:top w:val="single" w:sz="4" w:color="9AA5B1"/>
+              <w:left w:val="single" w:sz="4" w:color="9AA5B1"/>
+              <w:bottom w:val="single" w:sz="4" w:color="9AA5B1"/>
+              <w:right w:val="single" w:sz="4" w:color="9AA5B1"/>
+            </w:tcBorders>
+          </w:tcPr>
+          <w:p>
+            <w:r/>
+            <w:r>
+              <w:rPr>
+                <w:rFonts w:ascii="Times New Roman" w:hAnsi="Times New Roman" w:cs="Times New Roman" w:eastAsia="Times New Roman"/>
+                <w:b w:val="0"/>
+                <w:i w:val="0"/>
+                <w:sz w:val="22"/>
+              </w:rPr>
+              <w:t xml:space="preserve">Bấm </w:t>
+            </w:r>
+            <w:r>
+              <w:rPr>
+                <w:rFonts w:ascii="Times New Roman" w:hAnsi="Times New Roman" w:cs="Times New Roman" w:eastAsia="Times New Roman"/>
+                <w:b/>
+                <w:i w:val="0"/>
+                <w:sz w:val="22"/>
+              </w:rPr>
+              <w:t>XÓA</w:t>
+            </w:r>
+            <w:r>
+              <w:rPr>
+                <w:rFonts w:ascii="Times New Roman" w:hAnsi="Times New Roman" w:cs="Times New Roman" w:eastAsia="Times New Roman"/>
+                <w:b w:val="0"/>
+                <w:i w:val="0"/>
+                <w:sz w:val="22"/>
+              </w:rPr>
+              <w:t xml:space="preserve"> trên một dòng</w:t>
+            </w:r>
+          </w:p>
+        </w:tc>
+        <w:tc>
+          <w:tcPr>
+            <w:tcW w:type="dxa" w:w="4320"/>
+            <w:tcBorders>
+              <w:top w:val="single" w:sz="4" w:color="9AA5B1"/>
+              <w:left w:val="single" w:sz="4" w:color="9AA5B1"/>
+              <w:bottom w:val="single" w:sz="4" w:color="9AA5B1"/>
+              <w:right w:val="single" w:sz="4" w:color="9AA5B1"/>
+            </w:tcBorders>
+          </w:tcPr>
+          <w:p>
+            <w:r/>
+            <w:r>
+              <w:rPr>
+                <w:rFonts w:ascii="Times New Roman" w:hAnsi="Times New Roman" w:cs="Times New Roman" w:eastAsia="Times New Roman"/>
+                <w:b w:val="0"/>
+                <w:i w:val="0"/>
+                <w:sz w:val="22"/>
+              </w:rPr>
+              <w:t>Hỏi xác nhận, đồng ý thì xóa công khám đó; danh sách và số trên nút Đăng ký cập nhật ngay</w:t>
+            </w:r>
+          </w:p>
+        </w:tc>
+      </w:tr>
+      <w:tr>
+        <w:tc>
+          <w:tcPr>
+            <w:tcW w:type="dxa" w:w="4320"/>
+            <w:tcBorders>
+              <w:top w:val="single" w:sz="4" w:color="9AA5B1"/>
+              <w:left w:val="single" w:sz="4" w:color="9AA5B1"/>
+              <w:bottom w:val="single" w:sz="4" w:color="9AA5B1"/>
+              <w:right w:val="single" w:sz="4" w:color="9AA5B1"/>
+            </w:tcBorders>
+          </w:tcPr>
+          <w:p>
+            <w:r/>
+            <w:r>
+              <w:rPr>
+                <w:rFonts w:ascii="Times New Roman" w:hAnsi="Times New Roman" w:cs="Times New Roman" w:eastAsia="Times New Roman"/>
+                <w:b w:val="0"/>
+                <w:i w:val="0"/>
+                <w:sz w:val="22"/>
+              </w:rPr>
+              <w:t>Xóa hết danh sách</w:t>
+            </w:r>
+          </w:p>
+        </w:tc>
+        <w:tc>
+          <w:tcPr>
+            <w:tcW w:type="dxa" w:w="4320"/>
+            <w:tcBorders>
+              <w:top w:val="single" w:sz="4" w:color="9AA5B1"/>
+              <w:left w:val="single" w:sz="4" w:color="9AA5B1"/>
+              <w:bottom w:val="single" w:sz="4" w:color="9AA5B1"/>
+              <w:right w:val="single" w:sz="4" w:color="9AA5B1"/>
+            </w:tcBorders>
+          </w:tcPr>
+          <w:p>
+            <w:r/>
+            <w:r>
+              <w:rPr>
+                <w:rFonts w:ascii="Times New Roman" w:hAnsi="Times New Roman" w:cs="Times New Roman" w:eastAsia="Times New Roman"/>
+                <w:b w:val="0"/>
+                <w:i w:val="0"/>
+                <w:sz w:val="22"/>
+              </w:rPr>
+              <w:t>Nút Đăng ký mờ đi, người bệnh bấm ĐÓNG để chọn lại từ đầu</w:t>
+            </w:r>
+          </w:p>
+        </w:tc>
+      </w:tr>
+      <w:tr>
+        <w:tc>
+          <w:tcPr>
+            <w:tcW w:type="dxa" w:w="4320"/>
+            <w:tcBorders>
+              <w:top w:val="single" w:sz="4" w:color="9AA5B1"/>
+              <w:left w:val="single" w:sz="4" w:color="9AA5B1"/>
+              <w:bottom w:val="single" w:sz="4" w:color="9AA5B1"/>
+              <w:right w:val="single" w:sz="4" w:color="9AA5B1"/>
+            </w:tcBorders>
+          </w:tcPr>
+          <w:p>
+            <w:r/>
+            <w:r>
+              <w:rPr>
+                <w:rFonts w:ascii="Times New Roman" w:hAnsi="Times New Roman" w:cs="Times New Roman" w:eastAsia="Times New Roman"/>
+                <w:b w:val="0"/>
+                <w:i w:val="0"/>
+                <w:sz w:val="22"/>
+              </w:rPr>
+              <w:t xml:space="preserve">Bấm </w:t>
+            </w:r>
+            <w:r>
+              <w:rPr>
+                <w:rFonts w:ascii="Times New Roman" w:hAnsi="Times New Roman" w:cs="Times New Roman" w:eastAsia="Times New Roman"/>
+                <w:b/>
+                <w:i w:val="0"/>
+                <w:sz w:val="22"/>
+              </w:rPr>
+              <w:t>+ CHỌN THÊM PHÒNG</w:t>
+            </w:r>
+          </w:p>
+        </w:tc>
+        <w:tc>
+          <w:tcPr>
+            <w:tcW w:type="dxa" w:w="4320"/>
+            <w:tcBorders>
+              <w:top w:val="single" w:sz="4" w:color="9AA5B1"/>
+              <w:left w:val="single" w:sz="4" w:color="9AA5B1"/>
+              <w:bottom w:val="single" w:sz="4" w:color="9AA5B1"/>
+              <w:right w:val="single" w:sz="4" w:color="9AA5B1"/>
+            </w:tcBorders>
+          </w:tcPr>
+          <w:p>
+            <w:r/>
+            <w:r>
+              <w:rPr>
+                <w:rFonts w:ascii="Times New Roman" w:hAnsi="Times New Roman" w:cs="Times New Roman" w:eastAsia="Times New Roman"/>
+                <w:b w:val="0"/>
+                <w:i w:val="0"/>
+                <w:sz w:val="22"/>
+              </w:rPr>
+              <w:t>Đóng cửa sổ, quay về màn chọn phòng, danh sách giữ nguyên</w:t>
+            </w:r>
+          </w:p>
+        </w:tc>
+      </w:tr>
+      <w:tr>
+        <w:tc>
+          <w:tcPr>
+            <w:tcW w:type="dxa" w:w="4320"/>
+            <w:tcBorders>
+              <w:top w:val="single" w:sz="4" w:color="9AA5B1"/>
+              <w:left w:val="single" w:sz="4" w:color="9AA5B1"/>
+              <w:bottom w:val="single" w:sz="4" w:color="9AA5B1"/>
+              <w:right w:val="single" w:sz="4" w:color="9AA5B1"/>
+            </w:tcBorders>
+          </w:tcPr>
+          <w:p>
+            <w:r/>
+            <w:r>
+              <w:rPr>
+                <w:rFonts w:ascii="Times New Roman" w:hAnsi="Times New Roman" w:cs="Times New Roman" w:eastAsia="Times New Roman"/>
+                <w:b w:val="0"/>
+                <w:i w:val="0"/>
+                <w:sz w:val="22"/>
+              </w:rPr>
+              <w:t xml:space="preserve">Bấm </w:t>
+            </w:r>
+            <w:r>
+              <w:rPr>
+                <w:rFonts w:ascii="Times New Roman" w:hAnsi="Times New Roman" w:cs="Times New Roman" w:eastAsia="Times New Roman"/>
+                <w:b/>
+                <w:i w:val="0"/>
+                <w:sz w:val="22"/>
+              </w:rPr>
+              <w:t>ĐĂNG KÝ (n)</w:t>
+            </w:r>
+          </w:p>
+        </w:tc>
+        <w:tc>
+          <w:tcPr>
+            <w:tcW w:type="dxa" w:w="4320"/>
+            <w:tcBorders>
+              <w:top w:val="single" w:sz="4" w:color="9AA5B1"/>
+              <w:left w:val="single" w:sz="4" w:color="9AA5B1"/>
+              <w:bottom w:val="single" w:sz="4" w:color="9AA5B1"/>
+              <w:right w:val="single" w:sz="4" w:color="9AA5B1"/>
+            </w:tcBorders>
+          </w:tcPr>
+          <w:p>
+            <w:r/>
+            <w:r>
+              <w:rPr>
+                <w:rFonts w:ascii="Times New Roman" w:hAnsi="Times New Roman" w:cs="Times New Roman" w:eastAsia="Times New Roman"/>
+                <w:b w:val="0"/>
+                <w:i w:val="0"/>
+                <w:sz w:val="22"/>
+              </w:rPr>
+              <w:t>Đóng cửa sổ và đăng ký toàn bộ công khám trong danh sách</w:t>
+            </w:r>
+          </w:p>
+        </w:tc>
+      </w:tr>
+      <w:tr>
+        <w:tc>
+          <w:tcPr>
+            <w:tcW w:type="dxa" w:w="4320"/>
+            <w:tcBorders>
+              <w:top w:val="single" w:sz="4" w:color="9AA5B1"/>
+              <w:left w:val="single" w:sz="4" w:color="9AA5B1"/>
+              <w:bottom w:val="single" w:sz="4" w:color="9AA5B1"/>
+              <w:right w:val="single" w:sz="4" w:color="9AA5B1"/>
+            </w:tcBorders>
+          </w:tcPr>
+          <w:p>
+            <w:r/>
+            <w:r>
+              <w:rPr>
+                <w:rFonts w:ascii="Times New Roman" w:hAnsi="Times New Roman" w:cs="Times New Roman" w:eastAsia="Times New Roman"/>
+                <w:b w:val="0"/>
+                <w:i w:val="0"/>
+                <w:sz w:val="22"/>
+              </w:rPr>
+              <w:t xml:space="preserve">Bấm </w:t>
+            </w:r>
+            <w:r>
+              <w:rPr>
+                <w:rFonts w:ascii="Times New Roman" w:hAnsi="Times New Roman" w:cs="Times New Roman" w:eastAsia="Times New Roman"/>
+                <w:b/>
+                <w:i w:val="0"/>
+                <w:sz w:val="22"/>
+              </w:rPr>
+              <w:t>ĐÓNG</w:t>
+            </w:r>
+          </w:p>
+        </w:tc>
+        <w:tc>
+          <w:tcPr>
+            <w:tcW w:type="dxa" w:w="4320"/>
+            <w:tcBorders>
+              <w:top w:val="single" w:sz="4" w:color="9AA5B1"/>
+              <w:left w:val="single" w:sz="4" w:color="9AA5B1"/>
+              <w:bottom w:val="single" w:sz="4" w:color="9AA5B1"/>
+              <w:right w:val="single" w:sz="4" w:color="9AA5B1"/>
+            </w:tcBorders>
+          </w:tcPr>
+          <w:p>
+            <w:r/>
+            <w:r>
+              <w:rPr>
+                <w:rFonts w:ascii="Times New Roman" w:hAnsi="Times New Roman" w:cs="Times New Roman" w:eastAsia="Times New Roman"/>
+                <w:b w:val="0"/>
+                <w:i w:val="0"/>
+                <w:sz w:val="22"/>
+              </w:rPr>
+              <w:t xml:space="preserve">Quay về màn chọn phòng, danh sách giữ nguyên, </w:t>
+            </w:r>
+            <w:r>
+              <w:rPr>
+                <w:rFonts w:ascii="Times New Roman" w:hAnsi="Times New Roman" w:cs="Times New Roman" w:eastAsia="Times New Roman"/>
+                <w:b/>
+                <w:i w:val="0"/>
+                <w:sz w:val="22"/>
+              </w:rPr>
+              <w:t>không</w:t>
+            </w:r>
+            <w:r>
+              <w:rPr>
+                <w:rFonts w:ascii="Times New Roman" w:hAnsi="Times New Roman" w:cs="Times New Roman" w:eastAsia="Times New Roman"/>
+                <w:b w:val="0"/>
+                <w:i w:val="0"/>
+                <w:sz w:val="22"/>
+              </w:rPr>
+              <w:t xml:space="preserve"> đăng ký</w:t>
+            </w:r>
+          </w:p>
+        </w:tc>
+      </w:tr>
+      <w:tr>
+        <w:tc>
+          <w:tcPr>
+            <w:tcW w:type="dxa" w:w="4320"/>
+            <w:tcBorders>
+              <w:top w:val="single" w:sz="4" w:color="9AA5B1"/>
+              <w:left w:val="single" w:sz="4" w:color="9AA5B1"/>
+              <w:bottom w:val="single" w:sz="4" w:color="9AA5B1"/>
+              <w:right w:val="single" w:sz="4" w:color="9AA5B1"/>
+            </w:tcBorders>
+          </w:tcPr>
+          <w:p>
+            <w:r/>
+            <w:r>
+              <w:rPr>
+                <w:rFonts w:ascii="Times New Roman" w:hAnsi="Times New Roman" w:cs="Times New Roman" w:eastAsia="Times New Roman"/>
+                <w:b w:val="0"/>
+                <w:i w:val="0"/>
+                <w:sz w:val="22"/>
+              </w:rPr>
+              <w:t>Không thao tác quá thời gian chờ</w:t>
+            </w:r>
+          </w:p>
+        </w:tc>
+        <w:tc>
+          <w:tcPr>
+            <w:tcW w:type="dxa" w:w="4320"/>
+            <w:tcBorders>
+              <w:top w:val="single" w:sz="4" w:color="9AA5B1"/>
+              <w:left w:val="single" w:sz="4" w:color="9AA5B1"/>
+              <w:bottom w:val="single" w:sz="4" w:color="9AA5B1"/>
+              <w:right w:val="single" w:sz="4" w:color="9AA5B1"/>
+            </w:tcBorders>
+          </w:tcPr>
+          <w:p>
+            <w:r/>
+            <w:r>
+              <w:rPr>
+                <w:rFonts w:ascii="Times New Roman" w:hAnsi="Times New Roman" w:cs="Times New Roman" w:eastAsia="Times New Roman"/>
+                <w:b w:val="0"/>
+                <w:i w:val="0"/>
+                <w:sz w:val="22"/>
+              </w:rPr>
+              <w:t xml:space="preserve">Cửa sổ tự đóng, quay về màn chờ, </w:t>
+            </w:r>
+            <w:r>
+              <w:rPr>
+                <w:rFonts w:ascii="Times New Roman" w:hAnsi="Times New Roman" w:cs="Times New Roman" w:eastAsia="Times New Roman"/>
+                <w:b/>
+                <w:i w:val="0"/>
+                <w:sz w:val="22"/>
+              </w:rPr>
+              <w:t>không</w:t>
+            </w:r>
+            <w:r>
+              <w:rPr>
+                <w:rFonts w:ascii="Times New Roman" w:hAnsi="Times New Roman" w:cs="Times New Roman" w:eastAsia="Times New Roman"/>
+                <w:b w:val="0"/>
+                <w:i w:val="0"/>
+                <w:sz w:val="22"/>
+              </w:rPr>
+              <w:t xml:space="preserve"> đăng ký</w:t>
+            </w:r>
+          </w:p>
+        </w:tc>
+      </w:tr>
+    </w:tbl>
     <w:p/>
     <w:p>
       <w:pPr>
@@ -1985,7 +2386,7 @@
           <w:i w:val="0"/>
           <w:sz w:val="24"/>
         </w:rPr>
-        <w:t>Danh sách này thay cho vùng "công khám đã chọn" trên màn hình — người bệnh vẫn đối chiếu được đầy đủ trước khi đăng ký, mà giao diện kiosk không phải thay đổi.</w:t>
+        <w:t>Dòng ghi chú dưới lưới chỉ hiện khi có từ hai công khám trở lên.</w:t>
       </w:r>
     </w:p>
     <w:p>
@@ -2000,7 +2401,7 @@
           <w:color w:val="12457A"/>
           <w:sz w:val="27"/>
         </w:rPr>
-        <w:t>2.3 Khi chạm lại phòng đã chọn</w:t>
+        <w:t>2.3 Cửa sổ chọn dịch vụ khám của phòng</w:t>
       </w:r>
     </w:p>
     <w:p>
@@ -2015,171 +2416,7 @@
           <w:i w:val="0"/>
           <w:sz w:val="24"/>
         </w:rPr>
-        <w:t>Kiosk hiển thị danh sách đã chọn kèm hai lựa chọn:</w:t>
-      </w:r>
-    </w:p>
-    <w:p>
-      <w:pPr>
-        <w:spacing w:after="0"/>
-        <w:ind w:left="360"/>
-      </w:pPr>
-      <w:r>
-        <w:rPr>
-          <w:rFonts w:ascii="Consolas" w:hAnsi="Consolas" w:cs="Consolas" w:eastAsia="Consolas"/>
-          <w:b w:val="0"/>
-          <w:i w:val="0"/>
-          <w:sz w:val="21"/>
-        </w:rPr>
-        <w:t>Bạn đã chọn:</w:t>
-      </w:r>
-    </w:p>
-    <w:p>
-      <w:pPr>
-        <w:spacing w:after="0"/>
-        <w:ind w:left="360"/>
-      </w:pPr>
-      <w:r>
-        <w:rPr>
-          <w:rFonts w:ascii="Consolas" w:hAnsi="Consolas" w:cs="Consolas" w:eastAsia="Consolas"/>
-          <w:b w:val="0"/>
-          <w:i w:val="0"/>
-          <w:sz w:val="21"/>
-        </w:rPr>
-        <w:t>1. Phòng khám Nội tổng hợp - Khám nội tổng hợp</w:t>
-      </w:r>
-    </w:p>
-    <w:p>
-      <w:pPr>
-        <w:spacing w:after="0"/>
-        <w:ind w:left="360"/>
-      </w:pPr>
-      <w:r>
-        <w:rPr>
-          <w:rFonts w:ascii="Consolas" w:hAnsi="Consolas" w:cs="Consolas" w:eastAsia="Consolas"/>
-          <w:b w:val="0"/>
-          <w:i w:val="0"/>
-          <w:sz w:val="21"/>
-        </w:rPr>
-        <w:t>2. Phòng khám Tai Mũi Họng - Khám tai mũi họng</w:t>
-      </w:r>
-    </w:p>
-    <w:p>
-      <w:pPr>
-        <w:spacing w:after="0"/>
-        <w:ind w:left="360"/>
-      </w:pPr>
-      <w:r>
-        <w:rPr>
-          <w:rFonts w:ascii="Consolas" w:hAnsi="Consolas" w:cs="Consolas" w:eastAsia="Consolas"/>
-          <w:b w:val="0"/>
-          <w:i w:val="0"/>
-          <w:sz w:val="21"/>
-        </w:rPr>
-      </w:r>
-    </w:p>
-    <w:p>
-      <w:pPr>
-        <w:spacing w:after="0"/>
-        <w:ind w:left="360"/>
-      </w:pPr>
-      <w:r>
-        <w:rPr>
-          <w:rFonts w:ascii="Consolas" w:hAnsi="Consolas" w:cs="Consolas" w:eastAsia="Consolas"/>
-          <w:b w:val="0"/>
-          <w:i w:val="0"/>
-          <w:sz w:val="21"/>
-        </w:rPr>
-        <w:t>Phòng khám này đã được chọn.</w:t>
-      </w:r>
-    </w:p>
-    <w:p>
-      <w:pPr>
-        <w:spacing w:after="0"/>
-        <w:ind w:left="360"/>
-      </w:pPr>
-      <w:r>
-        <w:rPr>
-          <w:rFonts w:ascii="Consolas" w:hAnsi="Consolas" w:cs="Consolas" w:eastAsia="Consolas"/>
-          <w:b w:val="0"/>
-          <w:i w:val="0"/>
-          <w:sz w:val="21"/>
-        </w:rPr>
-        <w:t>Chọn "Có" để đăng ký, chọn "Không" để bỏ chọn phòng này.</w:t>
-      </w:r>
-    </w:p>
-    <w:p>
-      <w:pPr>
-        <w:spacing w:after="0"/>
-        <w:ind w:left="360"/>
-      </w:pPr>
-      <w:r>
-        <w:rPr>
-          <w:rFonts w:ascii="Consolas" w:hAnsi="Consolas" w:cs="Consolas" w:eastAsia="Consolas"/>
-          <w:b w:val="0"/>
-          <w:i w:val="0"/>
-          <w:sz w:val="21"/>
-        </w:rPr>
-      </w:r>
-    </w:p>
-    <w:p>
-      <w:pPr>
-        <w:spacing w:after="0"/>
-        <w:ind w:left="360"/>
-      </w:pPr>
-      <w:r>
-        <w:rPr>
-          <w:rFonts w:ascii="Consolas" w:hAnsi="Consolas" w:cs="Consolas" w:eastAsia="Consolas"/>
-          <w:b w:val="0"/>
-          <w:i w:val="0"/>
-          <w:sz w:val="21"/>
-        </w:rPr>
-        <w:t xml:space="preserve">                              [ Có ]   [ Không ]</w:t>
-      </w:r>
-    </w:p>
-    <w:p/>
-    <w:p>
-      <w:pPr>
-        <w:spacing w:after="120"/>
-        <w:jc w:val="both"/>
-      </w:pPr>
-      <w:r>
-        <w:rPr>
-          <w:rFonts w:ascii="Times New Roman" w:hAnsi="Times New Roman" w:cs="Times New Roman" w:eastAsia="Times New Roman"/>
-          <w:b w:val="0"/>
-          <w:i w:val="0"/>
-          <w:sz w:val="24"/>
-        </w:rPr>
-        <w:t>Đây cũng là đường thoát khi đăng ký thất bại: người bệnh chạm lại một phòng đã chọn rồi trả lời "Có" để thử đăng ký lại.</w:t>
-      </w:r>
-    </w:p>
-    <w:p>
-      <w:pPr>
-        <w:spacing w:before="200" w:after="120"/>
-      </w:pPr>
-      <w:r>
-        <w:rPr>
-          <w:rFonts w:ascii="Times New Roman" w:hAnsi="Times New Roman" w:cs="Times New Roman" w:eastAsia="Times New Roman"/>
-          <w:b/>
-          <w:i w:val="0"/>
-          <w:color w:val="12457A"/>
-          <w:sz w:val="27"/>
-        </w:rPr>
-        <w:t>2.4 Cửa sổ chọn dịch vụ khám của phòng</w:t>
-      </w:r>
-    </w:p>
-    <w:p>
-      <w:pPr>
-        <w:spacing w:after="120"/>
-        <w:jc w:val="both"/>
-      </w:pPr>
-      <w:r>
-        <w:rPr>
-          <w:rFonts w:ascii="Times New Roman" w:hAnsi="Times New Roman" w:cs="Times New Roman" w:eastAsia="Times New Roman"/>
-          <w:b w:val="0"/>
-          <w:i w:val="0"/>
-          <w:sz w:val="24"/>
-        </w:rPr>
-        <w:t xml:space="preserve">Giữ nguyên bố cục và cách hiển thị hiện tại. Khác biệt duy nhất: chạm vào một dịch vụ </w:t>
+        <w:t xml:space="preserve">Giữ nguyên bố cục hiện tại. Khác biệt duy nhất: chạm vào một dịch vụ </w:t>
       </w:r>
       <w:r>
         <w:rPr>
@@ -2215,7 +2452,7 @@
           <w:i w:val="0"/>
           <w:sz w:val="24"/>
         </w:rPr>
-        <w:t xml:space="preserve"> đăng ký ngay — cửa sổ đóng lại, dịch vụ được ghi vào danh sách, rồi màn chọn phòng hỏi tiếp theo mục 2.2.</w:t>
+        <w:t xml:space="preserve"> đăng ký ngay — cửa sổ đóng lại, dịch vụ được ghi vào danh sách, rồi cửa sổ danh sách (2.2) mở ra.</w:t>
       </w:r>
     </w:p>
     <w:p>
@@ -2230,7 +2467,7 @@
           <w:color w:val="12457A"/>
           <w:sz w:val="27"/>
         </w:rPr>
-        <w:t>2.5 Phiếu in</w:t>
+        <w:t>2.4 Phiếu in</w:t>
       </w:r>
     </w:p>
     <w:p>
@@ -2278,7 +2515,7 @@
           <w:color w:val="12457A"/>
           <w:sz w:val="27"/>
         </w:rPr>
-        <w:t>2.6 Thông báo cho người bệnh</w:t>
+        <w:t>2.5 Thông báo cho người bệnh</w:t>
       </w:r>
     </w:p>
     <w:tbl>
@@ -2370,7 +2607,7 @@
                 <w:i w:val="0"/>
                 <w:sz w:val="22"/>
               </w:rPr>
-              <w:t>Chạm lại phòng đã chọn</w:t>
+              <w:t>Bấm XÓA trên một dòng</w:t>
             </w:r>
           </w:p>
         </w:tc>
@@ -2393,7 +2630,7 @@
                 <w:i w:val="0"/>
                 <w:sz w:val="22"/>
               </w:rPr>
-              <w:t>"Phòng khám này đã được chọn. Chọn "Có" để đăng ký, chọn "Không" để bỏ chọn phòng này."</w:t>
+              <w:t>"Bạn có muốn bỏ phòng khám {tên phòng} khỏi danh sách không?"</w:t>
             </w:r>
           </w:p>
         </w:tc>
@@ -2594,7 +2831,7 @@
                 <w:i w:val="0"/>
                 <w:sz w:val="22"/>
               </w:rPr>
-              <w:t>danh sách đã chọn được giữ lại</w:t>
+              <w:t>danh sách được giữ lại</w:t>
             </w:r>
             <w:r>
               <w:rPr>
@@ -2603,7 +2840,7 @@
                 <w:i w:val="0"/>
                 <w:sz w:val="22"/>
               </w:rPr>
-              <w:t xml:space="preserve"> để bỏ chọn phòng đó rồi đăng ký lại</w:t>
+              <w:t xml:space="preserve"> để xóa phòng đó rồi đăng ký lại</w:t>
             </w:r>
           </w:p>
         </w:tc>
@@ -3023,7 +3260,7 @@
           <w:i w:val="0"/>
           <w:sz w:val="24"/>
         </w:rPr>
-        <w:t>Một phòng khám chỉ được chọn một lần trong cùng một lượt. Chạm lại vào phòng đã chọn dẫn tới hộp thoại đăng ký hoặc bỏ chọn (2.3), không phải thêm lần hai.</w:t>
+        <w:t>Một phòng khám chỉ được chọn một lần trong cùng một lượt. Chạm lại vào phòng đã chọn sẽ mở cửa sổ danh sách (2.2), không phải thêm lần hai.</w:t>
       </w:r>
     </w:p>
     <w:p>
@@ -3038,7 +3275,25 @@
           <w:i w:val="0"/>
           <w:sz w:val="24"/>
         </w:rPr>
-        <w:t>Nếu bỏ chọn đúng công khám chính thì công khám được chọn kế tiếp trở thành công khám chính (QT-05).</w:t>
+        <w:t xml:space="preserve">Xóa công khám thực hiện tại cửa sổ danh sách, xóa được </w:t>
+      </w:r>
+      <w:r>
+        <w:rPr>
+          <w:rFonts w:ascii="Times New Roman" w:hAnsi="Times New Roman" w:cs="Times New Roman" w:eastAsia="Times New Roman"/>
+          <w:b/>
+          <w:i w:val="0"/>
+          <w:sz w:val="24"/>
+        </w:rPr>
+        <w:t>bất kỳ dòng nào</w:t>
+      </w:r>
+      <w:r>
+        <w:rPr>
+          <w:rFonts w:ascii="Times New Roman" w:hAnsi="Times New Roman" w:cs="Times New Roman" w:eastAsia="Times New Roman"/>
+          <w:b w:val="0"/>
+          <w:i w:val="0"/>
+          <w:sz w:val="24"/>
+        </w:rPr>
+        <w:t>. Nếu xóa đúng dòng đầu tiên thì dòng kế tiếp trở thành công khám chính (QT-05).</w:t>
       </w:r>
     </w:p>
     <w:p>
@@ -3176,7 +3431,7 @@
           <w:i w:val="0"/>
           <w:sz w:val="24"/>
         </w:rPr>
-        <w:t>Các công khám chọn sau là khám thường, không phải khám chính. Thứ tự này hiển thị cho người bệnh trong hộp thoại xác nhận (2.2).</w:t>
+        <w:t>Các công khám chọn sau là khám thường, không phải khám chính. Thứ tự hiển thị ở cột TT của cửa sổ danh sách (2.2), kèm ghi chú "Phòng khám đầu tiên trong danh sách là phòng khám chính".</w:t>
       </w:r>
     </w:p>
     <w:p>
@@ -4064,7 +4319,7 @@
                 <w:i w:val="0"/>
                 <w:sz w:val="22"/>
               </w:rPr>
-              <w:t>Bật key. Chọn phòng Nội tổng hợp rồi trả lời "Không"</w:t>
+              <w:t>Bật key. Chọn phòng Nội tổng hợp rồi bấm ĐĂNG KÝ</w:t>
             </w:r>
           </w:p>
         </w:tc>
@@ -4135,7 +4390,7 @@
                 <w:i w:val="0"/>
                 <w:sz w:val="22"/>
               </w:rPr>
-              <w:t>Chọn phòng Nội tổng hợp, trả lời "Có", chọn phòng Tai Mũi Họng, trả lời "Không"</w:t>
+              <w:t>Chọn Nội tổng hợp, bấm CHỌN THÊM PHÒNG, chọn Tai Mũi Họng, bấm ĐĂNG KÝ</w:t>
             </w:r>
           </w:p>
         </w:tc>
@@ -4206,7 +4461,7 @@
                 <w:i w:val="0"/>
                 <w:sz w:val="22"/>
               </w:rPr>
-              <w:t>Chọn ba phòng rồi trả lời "Không"</w:t>
+              <w:t>Chọn ba phòng rồi bấm ĐĂNG KÝ</w:t>
             </w:r>
           </w:p>
         </w:tc>
@@ -4277,7 +4532,7 @@
                 <w:i w:val="0"/>
                 <w:sz w:val="22"/>
               </w:rPr>
-              <w:t>Chọn phòng Nội tổng hợp, trả lời "Có", rồi chạm lại chính ô đó, trả lời "Không"</w:t>
+              <w:t>Chọn ba phòng, bấm XÓA ở dòng 2, rồi bấm ĐĂNG KÝ</w:t>
             </w:r>
           </w:p>
         </w:tc>
@@ -4300,7 +4555,78 @@
                 <w:i w:val="0"/>
                 <w:sz w:val="22"/>
               </w:rPr>
-              <w:t>Bỏ chọn phòng đó, danh sách rỗng, chưa đăng ký gì (QT-03)</w:t>
+              <w:t>Chỉ đăng ký hai công khám còn lại, đúng phòng và dịch vụ còn trong danh sách (QT-03)</w:t>
+            </w:r>
+          </w:p>
+        </w:tc>
+      </w:tr>
+      <w:tr>
+        <w:tc>
+          <w:tcPr>
+            <w:tcW w:type="dxa" w:w="2880"/>
+            <w:tcBorders>
+              <w:top w:val="single" w:sz="4" w:color="9AA5B1"/>
+              <w:left w:val="single" w:sz="4" w:color="9AA5B1"/>
+              <w:bottom w:val="single" w:sz="4" w:color="9AA5B1"/>
+              <w:right w:val="single" w:sz="4" w:color="9AA5B1"/>
+            </w:tcBorders>
+          </w:tcPr>
+          <w:p>
+            <w:r/>
+            <w:r>
+              <w:rPr>
+                <w:rFonts w:ascii="Times New Roman" w:hAnsi="Times New Roman" w:cs="Times New Roman" w:eastAsia="Times New Roman"/>
+                <w:b w:val="0"/>
+                <w:i w:val="0"/>
+                <w:sz w:val="22"/>
+              </w:rPr>
+              <w:t>4b</w:t>
+            </w:r>
+          </w:p>
+        </w:tc>
+        <w:tc>
+          <w:tcPr>
+            <w:tcW w:type="dxa" w:w="2880"/>
+            <w:tcBorders>
+              <w:top w:val="single" w:sz="4" w:color="9AA5B1"/>
+              <w:left w:val="single" w:sz="4" w:color="9AA5B1"/>
+              <w:bottom w:val="single" w:sz="4" w:color="9AA5B1"/>
+              <w:right w:val="single" w:sz="4" w:color="9AA5B1"/>
+            </w:tcBorders>
+          </w:tcPr>
+          <w:p>
+            <w:r/>
+            <w:r>
+              <w:rPr>
+                <w:rFonts w:ascii="Times New Roman" w:hAnsi="Times New Roman" w:cs="Times New Roman" w:eastAsia="Times New Roman"/>
+                <w:b w:val="0"/>
+                <w:i w:val="0"/>
+                <w:sz w:val="22"/>
+              </w:rPr>
+              <w:t>Chọn ba phòng, bấm XÓA ở dòng 1</w:t>
+            </w:r>
+          </w:p>
+        </w:tc>
+        <w:tc>
+          <w:tcPr>
+            <w:tcW w:type="dxa" w:w="2880"/>
+            <w:tcBorders>
+              <w:top w:val="single" w:sz="4" w:color="9AA5B1"/>
+              <w:left w:val="single" w:sz="4" w:color="9AA5B1"/>
+              <w:bottom w:val="single" w:sz="4" w:color="9AA5B1"/>
+              <w:right w:val="single" w:sz="4" w:color="9AA5B1"/>
+            </w:tcBorders>
+          </w:tcPr>
+          <w:p>
+            <w:r/>
+            <w:r>
+              <w:rPr>
+                <w:rFonts w:ascii="Times New Roman" w:hAnsi="Times New Roman" w:cs="Times New Roman" w:eastAsia="Times New Roman"/>
+                <w:b w:val="0"/>
+                <w:i w:val="0"/>
+                <w:sz w:val="22"/>
+              </w:rPr>
+              <w:t>Dòng 2 trở thành dòng 1 và là công khám chính; khoa tiếp nhận lấy theo phòng đó (QT-05)</w:t>
             </w:r>
           </w:p>
         </w:tc>
@@ -4442,7 +4768,7 @@
                 <w:i w:val="0"/>
                 <w:sz w:val="22"/>
               </w:rPr>
-              <w:t>Từ chối cả lượt, thông báo nêu tên phòng hết lượt; danh sách được giữ lại để bỏ chọn phòng đó (QT-08, 2.6)</w:t>
+              <w:t>Từ chối cả lượt, thông báo nêu tên phòng hết lượt; chạm lại một phòng đã chọn để mở danh sách, XÓA phòng bị lỗi rồi ĐĂNG KÝ lại (QT-08, 2.5)</w:t>
             </w:r>
           </w:p>
         </w:tc>
@@ -4561,7 +4887,7 @@
                 <w:i w:val="0"/>
                 <w:sz w:val="22"/>
               </w:rPr>
-              <w:t>Chọn hai phòng, trả lời "Có" rồi bỏ đi</w:t>
+              <w:t>Chọn hai phòng rồi bỏ đi khi cửa sổ danh sách đang mở</w:t>
             </w:r>
           </w:p>
         </w:tc>
@@ -4584,7 +4910,7 @@
                 <w:i w:val="0"/>
                 <w:sz w:val="22"/>
               </w:rPr>
-              <w:t xml:space="preserve">Hết thời gian chờ, màn hình về màn chờ, </w:t>
+              <w:t xml:space="preserve">Hết thời gian chờ, cửa sổ tự đóng, về màn chờ, </w:t>
             </w:r>
             <w:r>
               <w:rPr>
@@ -5167,7 +5493,7 @@
           <w:i w:val="0"/>
           <w:sz w:val="24"/>
         </w:rPr>
-        <w:t>B1 — Chạm ô phòng: hộp thoại liệt kê công khám vừa chọn và hỏi chọn thêm (QT-01)</w:t>
+        <w:t>B1 — Chạm ô phòng: cửa sổ danh sách mở ra, có đúng công khám vừa chọn (QT-01)</w:t>
       </w:r>
     </w:p>
     <w:p>
@@ -5191,7 +5517,7 @@
           <w:i w:val="0"/>
           <w:sz w:val="24"/>
         </w:rPr>
-        <w:t>B2 — Chạm lại ô đã chọn, trả lời "Không": công khám đó bị xóa khỏi danh sách (QT-03)</w:t>
+        <w:t>B2 — Chạm lại ô phòng đã chọn: cửa sổ danh sách mở ra, không thêm dòng trùng (QT-03)</w:t>
       </w:r>
     </w:p>
     <w:p>
@@ -5215,7 +5541,7 @@
           <w:i w:val="0"/>
           <w:sz w:val="24"/>
         </w:rPr>
-        <w:t>B3 — Bỏ chọn đúng công khám đầu tiên: công khám kế tiếp trở thành công khám chính (QT-05)</w:t>
+        <w:t>B3 — Bấm XÓA dòng bất kỳ: hỏi xác nhận, đồng ý thì dòng biến mất, số trên nút ĐĂNG KÝ giảm đúng</w:t>
       </w:r>
     </w:p>
     <w:p>
@@ -5239,7 +5565,7 @@
           <w:i w:val="0"/>
           <w:sz w:val="24"/>
         </w:rPr>
-        <w:t>B4 — Phòng có nhiều dịch vụ: chọn dịch vụ xong quay lại màn chọn phòng, danh sách ghi đúng dịch vụ đã chọn</w:t>
+        <w:t>B4 — Bấm XÓA rồi trả lời "Không": danh sách giữ nguyên</w:t>
       </w:r>
     </w:p>
     <w:p>
@@ -5263,7 +5589,7 @@
           <w:i w:val="0"/>
           <w:sz w:val="24"/>
         </w:rPr>
-        <w:t>B5 — Phòng có một dịch vụ: thêm thẳng vào danh sách, không hỏi</w:t>
+        <w:t>B5 — Xóa dòng đầu tiên: dòng kế tiếp lên vị trí 1 và thành công khám chính (QT-05)</w:t>
       </w:r>
     </w:p>
     <w:p>
@@ -5287,7 +5613,7 @@
           <w:i w:val="0"/>
           <w:sz w:val="24"/>
         </w:rPr>
-        <w:t>B6 — Chọn từ 4 phòng trở lên: vẫn thêm được, không bị chặn số lượng khi key bật (QT-02)</w:t>
+        <w:t>B6 — Xóa hết các dòng: nút ĐĂNG KÝ mờ, bấm vào không có tác dụng</w:t>
       </w:r>
     </w:p>
     <w:p>
@@ -5311,7 +5637,7 @@
           <w:i w:val="0"/>
           <w:sz w:val="24"/>
         </w:rPr>
-        <w:t>B7 — Chọn hai phòng cùng dịch vụ khám: thông báo trùng dịch vụ (QT-04)</w:t>
+        <w:t>B7 — Bấm CHỌN THÊM PHÒNG: về màn chọn phòng, danh sách giữ nguyên; chọn tiếp thì danh sách có đủ</w:t>
       </w:r>
     </w:p>
     <w:p>
@@ -5335,7 +5661,7 @@
           <w:i w:val="0"/>
           <w:sz w:val="24"/>
         </w:rPr>
-        <w:t>B8 — Bỏ chọn hết công khám rồi chọn lại: đăng ký đúng công khám mới chọn</w:t>
+        <w:t>B8 — Bấm ĐÓNG: về màn chọn phòng, không đăng ký, danh sách giữ nguyên</w:t>
       </w:r>
     </w:p>
     <w:p>
@@ -5359,7 +5685,103 @@
           <w:i w:val="0"/>
           <w:sz w:val="24"/>
         </w:rPr>
-        <w:t>B9 — Thứ tự công khám trong hộp thoại đúng thứ tự chọn (QT-05)</w:t>
+        <w:t>B9 — Phòng có nhiều dịch vụ: chọn dịch vụ xong danh sách ghi đúng dịch vụ đã chọn</w:t>
+      </w:r>
+    </w:p>
+    <w:p>
+      <w:pPr>
+        <w:spacing w:after="40"/>
+        <w:ind w:left="360"/>
+      </w:pPr>
+      <w:r>
+        <w:rPr>
+          <w:rFonts w:ascii="Times New Roman" w:hAnsi="Times New Roman" w:cs="Times New Roman" w:eastAsia="Times New Roman"/>
+          <w:b w:val="0"/>
+          <w:i w:val="0"/>
+          <w:sz w:val="24"/>
+        </w:rPr>
+        <w:t xml:space="preserve">☐ </w:t>
+      </w:r>
+      <w:r>
+        <w:rPr>
+          <w:rFonts w:ascii="Times New Roman" w:hAnsi="Times New Roman" w:cs="Times New Roman" w:eastAsia="Times New Roman"/>
+          <w:b w:val="0"/>
+          <w:i w:val="0"/>
+          <w:sz w:val="24"/>
+        </w:rPr>
+        <w:t>B10 — Phòng có một dịch vụ: thêm thẳng vào danh sách, không hỏi chọn dịch vụ</w:t>
+      </w:r>
+    </w:p>
+    <w:p>
+      <w:pPr>
+        <w:spacing w:after="40"/>
+        <w:ind w:left="360"/>
+      </w:pPr>
+      <w:r>
+        <w:rPr>
+          <w:rFonts w:ascii="Times New Roman" w:hAnsi="Times New Roman" w:cs="Times New Roman" w:eastAsia="Times New Roman"/>
+          <w:b w:val="0"/>
+          <w:i w:val="0"/>
+          <w:sz w:val="24"/>
+        </w:rPr>
+        <w:t xml:space="preserve">☐ </w:t>
+      </w:r>
+      <w:r>
+        <w:rPr>
+          <w:rFonts w:ascii="Times New Roman" w:hAnsi="Times New Roman" w:cs="Times New Roman" w:eastAsia="Times New Roman"/>
+          <w:b w:val="0"/>
+          <w:i w:val="0"/>
+          <w:sz w:val="24"/>
+        </w:rPr>
+        <w:t>B11 — Chọn từ 4 phòng trở lên: vẫn thêm được, không bị chặn số lượng khi key bật (QT-02)</w:t>
+      </w:r>
+    </w:p>
+    <w:p>
+      <w:pPr>
+        <w:spacing w:after="40"/>
+        <w:ind w:left="360"/>
+      </w:pPr>
+      <w:r>
+        <w:rPr>
+          <w:rFonts w:ascii="Times New Roman" w:hAnsi="Times New Roman" w:cs="Times New Roman" w:eastAsia="Times New Roman"/>
+          <w:b w:val="0"/>
+          <w:i w:val="0"/>
+          <w:sz w:val="24"/>
+        </w:rPr>
+        <w:t xml:space="preserve">☐ </w:t>
+      </w:r>
+      <w:r>
+        <w:rPr>
+          <w:rFonts w:ascii="Times New Roman" w:hAnsi="Times New Roman" w:cs="Times New Roman" w:eastAsia="Times New Roman"/>
+          <w:b w:val="0"/>
+          <w:i w:val="0"/>
+          <w:sz w:val="24"/>
+        </w:rPr>
+        <w:t>B12 — Chọn hai phòng cùng dịch vụ khám: thông báo trùng dịch vụ (QT-04)</w:t>
+      </w:r>
+    </w:p>
+    <w:p>
+      <w:pPr>
+        <w:spacing w:after="40"/>
+        <w:ind w:left="360"/>
+      </w:pPr>
+      <w:r>
+        <w:rPr>
+          <w:rFonts w:ascii="Times New Roman" w:hAnsi="Times New Roman" w:cs="Times New Roman" w:eastAsia="Times New Roman"/>
+          <w:b w:val="0"/>
+          <w:i w:val="0"/>
+          <w:sz w:val="24"/>
+        </w:rPr>
+        <w:t xml:space="preserve">☐ </w:t>
+      </w:r>
+      <w:r>
+        <w:rPr>
+          <w:rFonts w:ascii="Times New Roman" w:hAnsi="Times New Roman" w:cs="Times New Roman" w:eastAsia="Times New Roman"/>
+          <w:b w:val="0"/>
+          <w:i w:val="0"/>
+          <w:sz w:val="24"/>
+        </w:rPr>
+        <w:t>B13 — Cột TT đánh số 1, 2, 3 đúng thứ tự chọn và đánh lại đúng sau khi xóa</w:t>
       </w:r>
     </w:p>
     <w:p>
@@ -5713,7 +6135,7 @@
           <w:i w:val="0"/>
           <w:sz w:val="24"/>
         </w:rPr>
-        <w:t>D2 — Sau lỗi, danh sách còn nguyên; chạm lại một phòng đã chọn rồi trả lời "Có" thì đăng ký lại được (2.3)</w:t>
+        <w:t>D2 — Sau lỗi, chạm lại một phòng đã chọn: cửa sổ danh sách còn nguyên các công khám, bấm ĐĂNG KÝ lại được (2.2)</w:t>
       </w:r>
     </w:p>
     <w:p>
@@ -5803,7 +6225,7 @@
           <w:i w:val="0"/>
           <w:sz w:val="24"/>
         </w:rPr>
-        <w:t>D5 — Sau lỗi ở D4, bỏ chọn phòng đó rồi đăng ký lại: thành công với các phòng còn lại</w:t>
+        <w:t>D5 — Sau lỗi ở D4, XÓA phòng bị lỗi trong cửa sổ danh sách rồi ĐĂNG KÝ lại: thành công với các phòng còn lại</w:t>
       </w:r>
     </w:p>
     <w:p>
@@ -6160,7 +6582,7 @@
           <w:i w:val="0"/>
           <w:sz w:val="24"/>
         </w:rPr>
-        <w:t>G2 — Mỗi lần chạm ô phòng làm bộ đếm chạy lại từ đầu</w:t>
+        <w:t>G2 — Mỗi lần chạm ô phòng hoặc bấm XÓA làm bộ đếm chạy lại từ đầu</w:t>
       </w:r>
     </w:p>
     <w:p>
@@ -6184,7 +6606,7 @@
           <w:i w:val="0"/>
           <w:sz w:val="24"/>
         </w:rPr>
-        <w:t xml:space="preserve">G3 — Trả lời "Không" hai lần liên tiếp thật nhanh: chỉ đăng ký </w:t>
+        <w:t xml:space="preserve">G3 — Bấm ĐĂNG KÝ hai lần liên tiếp thật nhanh: chỉ đăng ký </w:t>
       </w:r>
       <w:r>
         <w:rPr>
@@ -6265,7 +6687,7 @@
           <w:i w:val="0"/>
           <w:sz w:val="24"/>
         </w:rPr>
-        <w:t>H1 — Hộp thoại xác nhận đọc được ở khoảng cách đứng bình thường trước kiosk</w:t>
+        <w:t>H1 — Chữ trong cửa sổ danh sách đọc được ở khoảng cách đứng bình thường trước kiosk</w:t>
       </w:r>
     </w:p>
     <w:p>
@@ -6289,7 +6711,7 @@
           <w:i w:val="0"/>
           <w:sz w:val="24"/>
         </w:rPr>
-        <w:t>H2 — Hộp thoại liệt kê đủ các công khám đã chọn (thử với 5 công khám), không bị cắt chữ</w:t>
+        <w:t>H2 — Danh sách 5 công khám hiển thị đủ, cuộn được, không bị cắt chữ</w:t>
       </w:r>
     </w:p>
     <w:p>
@@ -6313,7 +6735,7 @@
           <w:i w:val="0"/>
           <w:sz w:val="24"/>
         </w:rPr>
-        <w:t>H3 — Nút Có/Không của hộp thoại đủ lớn để chạm bằng ngón tay</w:t>
+        <w:t>H3 — Nút XÓA trên từng dòng và ba nút dưới đủ lớn để chạm bằng ngón tay</w:t>
       </w:r>
     </w:p>
     <w:p>

</xml_diff>